<commit_message>
Refactor BKT output to full distributions, fix comment syntax, reorganize files
- Fix # -> % comment syntax in outputsT_at_varying_parameters.m
- Store per-trial sorted BKT arrays instead of min/median/max summaries
- Plot per-paramset 1-CDF survival curves (1000 trials overlaid) into one PDF
- Track p0 (fraction of disconnected networks) per param set
- transport_one.m: record timeout value on timed-out particle paths
- FracNet.m: pass timeout to simul_transport
- Move notebooks and model into Updated Code/, remove old copy directory
- Update .gitignore to exclude large data/output directories

Co-Authored-By: Claude Sonnet 4.6 <noreply@anthropic.com>
</commit_message>
<xml_diff>
--- a/Updated Code/Log of changes to FracNet code_202510.docx
+++ b/Updated Code/Log of changes to FracNet code_202510.docx
@@ -1,6 +1,6 @@
 
 <file path=word/document.xml><?xml version="1.0" encoding="utf-8"?>
-<w:document xmlns:wpc="http://schemas.microsoft.com/office/word/2010/wordprocessingCanvas" xmlns:cx="http://schemas.microsoft.com/office/drawing/2014/chartex" xmlns:cx1="http://schemas.microsoft.com/office/drawing/2015/9/8/chartex" xmlns:cx2="http://schemas.microsoft.com/office/drawing/2015/10/21/chartex" xmlns:cx3="http://schemas.microsoft.com/office/drawing/2016/5/9/chartex" xmlns:cx4="http://schemas.microsoft.com/office/drawing/2016/5/10/chartex" xmlns:cx5="http://schemas.microsoft.com/office/drawing/2016/5/11/chartex" xmlns:cx6="http://schemas.microsoft.com/office/drawing/2016/5/12/chartex" xmlns:cx7="http://schemas.microsoft.com/office/drawing/2016/5/13/chartex" xmlns:cx8="http://schemas.microsoft.com/office/drawing/2016/5/14/chartex" xmlns:mc="http://schemas.openxmlformats.org/markup-compatibility/2006" xmlns:aink="http://schemas.microsoft.com/office/drawing/2016/ink" xmlns:am3d="http://schemas.microsoft.com/office/drawing/2017/model3d" xmlns:o="urn:schemas-microsoft-com:office:office" xmlns:oel="http://schemas.microsoft.com/office/2019/extlst" xmlns:r="http://schemas.openxmlformats.org/officeDocument/2006/relationships" xmlns:m="http://schemas.openxmlformats.org/officeDocument/2006/math" xmlns:v="urn:schemas-microsoft-com:vml" xmlns:wp14="http://schemas.microsoft.com/office/word/2010/wordprocessingDrawing" xmlns:wp="http://schemas.openxmlformats.org/drawingml/2006/wordprocessingDrawing" xmlns:w10="urn:schemas-microsoft-com:office:word" xmlns:w="http://schemas.openxmlformats.org/wordprocessingml/2006/main" xmlns:w14="http://schemas.microsoft.com/office/word/2010/wordml" xmlns:w15="http://schemas.microsoft.com/office/word/2012/wordml" xmlns:w16cex="http://schemas.microsoft.com/office/word/2018/wordml/cex" xmlns:w16cid="http://schemas.microsoft.com/office/word/2016/wordml/cid" xmlns:w16="http://schemas.microsoft.com/office/word/2018/wordml" xmlns:w16sdtdh="http://schemas.microsoft.com/office/word/2020/wordml/sdtdatahash" xmlns:w16se="http://schemas.microsoft.com/office/word/2015/wordml/symex" xmlns:wpg="http://schemas.microsoft.com/office/word/2010/wordprocessingGroup" xmlns:wpi="http://schemas.microsoft.com/office/word/2010/wordprocessingInk" xmlns:wne="http://schemas.microsoft.com/office/word/2006/wordml" xmlns:wps="http://schemas.microsoft.com/office/word/2010/wordprocessingShape" mc:Ignorable="w14 w15 w16se w16cid w16 w16cex w16sdtdh wp14">
+<w:document xmlns:wpc="http://schemas.microsoft.com/office/word/2010/wordprocessingCanvas" xmlns:cx="http://schemas.microsoft.com/office/drawing/2014/chartex" xmlns:cx1="http://schemas.microsoft.com/office/drawing/2015/9/8/chartex" xmlns:cx2="http://schemas.microsoft.com/office/drawing/2015/10/21/chartex" xmlns:cx3="http://schemas.microsoft.com/office/drawing/2016/5/9/chartex" xmlns:cx4="http://schemas.microsoft.com/office/drawing/2016/5/10/chartex" xmlns:cx5="http://schemas.microsoft.com/office/drawing/2016/5/11/chartex" xmlns:cx6="http://schemas.microsoft.com/office/drawing/2016/5/12/chartex" xmlns:cx7="http://schemas.microsoft.com/office/drawing/2016/5/13/chartex" xmlns:cx8="http://schemas.microsoft.com/office/drawing/2016/5/14/chartex" xmlns:mc="http://schemas.openxmlformats.org/markup-compatibility/2006" xmlns:aink="http://schemas.microsoft.com/office/drawing/2016/ink" xmlns:am3d="http://schemas.microsoft.com/office/drawing/2017/model3d" xmlns:o="urn:schemas-microsoft-com:office:office" xmlns:oel="http://schemas.microsoft.com/office/2019/extlst" xmlns:r="http://schemas.openxmlformats.org/officeDocument/2006/relationships" xmlns:m="http://schemas.openxmlformats.org/officeDocument/2006/math" xmlns:v="urn:schemas-microsoft-com:vml" xmlns:wp14="http://schemas.microsoft.com/office/word/2010/wordprocessingDrawing" xmlns:wp="http://schemas.openxmlformats.org/drawingml/2006/wordprocessingDrawing" xmlns:w10="urn:schemas-microsoft-com:office:word" xmlns:w="http://schemas.openxmlformats.org/wordprocessingml/2006/main" xmlns:w14="http://schemas.microsoft.com/office/word/2010/wordml" xmlns:w15="http://schemas.microsoft.com/office/word/2012/wordml" xmlns:w16cex="http://schemas.microsoft.com/office/word/2018/wordml/cex" xmlns:w16cid="http://schemas.microsoft.com/office/word/2016/wordml/cid" xmlns:w16="http://schemas.microsoft.com/office/word/2018/wordml" xmlns:w16du="http://schemas.microsoft.com/office/word/2023/wordml/word16du" xmlns:w16sdtdh="http://schemas.microsoft.com/office/word/2020/wordml/sdtdatahash" xmlns:w16sdtfl="http://schemas.microsoft.com/office/word/2024/wordml/sdtformatlock" xmlns:w16se="http://schemas.microsoft.com/office/word/2015/wordml/symex" xmlns:wpg="http://schemas.microsoft.com/office/word/2010/wordprocessingGroup" xmlns:wpi="http://schemas.microsoft.com/office/word/2010/wordprocessingInk" xmlns:wne="http://schemas.microsoft.com/office/word/2006/wordml" xmlns:wps="http://schemas.microsoft.com/office/word/2010/wordprocessingShape" mc:Ignorable="w14 w15 w16se w16cid w16 w16cex w16sdtdh w16sdtfl w16du wp14">
   <w:body>
     <w:p>
       <w:r>
@@ -380,11 +380,31 @@
         <w:t>Np</w:t>
       </w:r>
       <w:r>
-        <w:t xml:space="preserve"> particle trajectories</w:t>
-      </w:r>
-      <w:r>
-        <w:t xml:space="preserve"> (this parameter has been added at the beginning of the file)</w:t>
-      </w:r>
+        <w:t xml:space="preserve"> particle trajectories (this parameter has been added at the beginning of the file).</w:t>
+      </w:r>
+    </w:p>
+    <w:p>
+      <w:pPr>
+        <w:pStyle w:val="ListParagraph"/>
+        <w:numPr>
+          <w:ilvl w:val="2"/>
+          <w:numId w:val="1"/>
+        </w:numPr>
+      </w:pPr>
+      <w:r>
+        <w:t>Plot particle trajectories on the fracture network</w:t>
+      </w:r>
+      <w:r>
+        <w:t xml:space="preserve">: </w:t>
+      </w:r>
+      <w:proofErr w:type="spellStart"/>
+      <w:r>
+        <w:rPr>
+          <w:rFonts w:ascii="Courier New" w:hAnsi="Courier New" w:cs="Courier New"/>
+        </w:rPr>
+        <w:t>plot_paths</w:t>
+      </w:r>
+      <w:proofErr w:type="spellEnd"/>
       <w:r>
         <w:t>.</w:t>
       </w:r>
@@ -398,7 +418,13 @@
         </w:numPr>
       </w:pPr>
       <w:r>
-        <w:t>Plot particle trajectories on the fracture network</w:t>
+        <w:t>Plot</w:t>
+      </w:r>
+      <w:r>
+        <w:t xml:space="preserve"> particle’s</w:t>
+      </w:r>
+      <w:r>
+        <w:t xml:space="preserve"> x vs t</w:t>
       </w:r>
       <w:r>
         <w:t xml:space="preserve">: </w:t>
@@ -408,7 +434,7 @@
         <w:rPr>
           <w:rFonts w:ascii="Courier New" w:hAnsi="Courier New" w:cs="Courier New"/>
         </w:rPr>
-        <w:t>plot_paths</w:t>
+        <w:t>plot_xptp</w:t>
       </w:r>
       <w:proofErr w:type="spellEnd"/>
       <w:r>
@@ -424,13 +450,7 @@
         </w:numPr>
       </w:pPr>
       <w:r>
-        <w:t>Plot</w:t>
-      </w:r>
-      <w:r>
-        <w:t xml:space="preserve"> particle’s</w:t>
-      </w:r>
-      <w:r>
-        <w:t xml:space="preserve"> x vs t</w:t>
+        <w:t>Plot histogram of breakthrough times</w:t>
       </w:r>
       <w:r>
         <w:t xml:space="preserve">: </w:t>
@@ -440,7 +460,7 @@
         <w:rPr>
           <w:rFonts w:ascii="Courier New" w:hAnsi="Courier New" w:cs="Courier New"/>
         </w:rPr>
-        <w:t>plot_xptp</w:t>
+        <w:t>plot_bkt</w:t>
       </w:r>
       <w:proofErr w:type="spellEnd"/>
       <w:r>
@@ -451,81 +471,54 @@
       <w:pPr>
         <w:pStyle w:val="ListParagraph"/>
         <w:numPr>
-          <w:ilvl w:val="2"/>
-          <w:numId w:val="1"/>
-        </w:numPr>
-      </w:pPr>
-      <w:r>
-        <w:t>Plot histogram of breakthrough times</w:t>
-      </w:r>
-      <w:r>
-        <w:t xml:space="preserve">: </w:t>
-      </w:r>
-      <w:proofErr w:type="spellStart"/>
-      <w:r>
-        <w:rPr>
-          <w:rFonts w:ascii="Courier New" w:hAnsi="Courier New" w:cs="Courier New"/>
-        </w:rPr>
-        <w:t>plot_bkt</w:t>
-      </w:r>
-      <w:proofErr w:type="spellEnd"/>
+          <w:ilvl w:val="0"/>
+          <w:numId w:val="1"/>
+        </w:numPr>
+      </w:pPr>
+      <w:proofErr w:type="spellStart"/>
+      <w:r>
+        <w:rPr>
+          <w:rFonts w:ascii="Courier New" w:hAnsi="Courier New" w:cs="Courier New"/>
+        </w:rPr>
+        <w:t>save_figure.m</w:t>
+      </w:r>
+      <w:proofErr w:type="spellEnd"/>
+      <w:r>
+        <w:t>:</w:t>
+      </w:r>
+    </w:p>
+    <w:p>
+      <w:pPr>
+        <w:pStyle w:val="ListParagraph"/>
+        <w:numPr>
+          <w:ilvl w:val="1"/>
+          <w:numId w:val="1"/>
+        </w:numPr>
+      </w:pPr>
+      <w:r>
+        <w:t xml:space="preserve">Figures now saved in </w:t>
+      </w:r>
+      <w:proofErr w:type="spellStart"/>
+      <w:r>
+        <w:rPr>
+          <w:rFonts w:ascii="Courier New" w:hAnsi="Courier New" w:cs="Courier New"/>
+        </w:rPr>
+        <w:t>png</w:t>
+      </w:r>
+      <w:proofErr w:type="spellEnd"/>
+      <w:r>
+        <w:t xml:space="preserve"> format, instead of </w:t>
+      </w:r>
+      <w:r>
+        <w:rPr>
+          <w:rFonts w:ascii="Courier New" w:hAnsi="Courier New" w:cs="Courier New"/>
+        </w:rPr>
+        <w:t>eps</w:t>
+      </w:r>
       <w:r>
         <w:t>.</w:t>
       </w:r>
     </w:p>
-    <w:p>
-      <w:pPr>
-        <w:pStyle w:val="ListParagraph"/>
-        <w:numPr>
-          <w:ilvl w:val="0"/>
-          <w:numId w:val="1"/>
-        </w:numPr>
-      </w:pPr>
-      <w:proofErr w:type="spellStart"/>
-      <w:r>
-        <w:rPr>
-          <w:rFonts w:ascii="Courier New" w:hAnsi="Courier New" w:cs="Courier New"/>
-        </w:rPr>
-        <w:t>save_figure.m</w:t>
-      </w:r>
-      <w:proofErr w:type="spellEnd"/>
-      <w:r>
-        <w:t>:</w:t>
-      </w:r>
-    </w:p>
-    <w:p>
-      <w:pPr>
-        <w:pStyle w:val="ListParagraph"/>
-        <w:numPr>
-          <w:ilvl w:val="1"/>
-          <w:numId w:val="1"/>
-        </w:numPr>
-      </w:pPr>
-      <w:r>
-        <w:t xml:space="preserve">Figures now saved in </w:t>
-      </w:r>
-      <w:proofErr w:type="spellStart"/>
-      <w:r>
-        <w:rPr>
-          <w:rFonts w:ascii="Courier New" w:hAnsi="Courier New" w:cs="Courier New"/>
-        </w:rPr>
-        <w:t>png</w:t>
-      </w:r>
-      <w:proofErr w:type="spellEnd"/>
-      <w:r>
-        <w:t xml:space="preserve"> format, instead of </w:t>
-      </w:r>
-      <w:r>
-        <w:rPr>
-          <w:rFonts w:ascii="Courier New" w:hAnsi="Courier New" w:cs="Courier New"/>
-        </w:rPr>
-        <w:t>eps</w:t>
-      </w:r>
-      <w:r>
-        <w:t>.</w:t>
-      </w:r>
-    </w:p>
-    <w:p/>
     <w:p/>
     <w:sectPr>
       <w:pgSz w:w="12240" w:h="15840"/>
@@ -538,7 +531,7 @@
 </file>
 
 <file path=word/numbering.xml><?xml version="1.0" encoding="utf-8"?>
-<w:numbering xmlns:wpc="http://schemas.microsoft.com/office/word/2010/wordprocessingCanvas" xmlns:cx="http://schemas.microsoft.com/office/drawing/2014/chartex" xmlns:cx1="http://schemas.microsoft.com/office/drawing/2015/9/8/chartex" xmlns:cx2="http://schemas.microsoft.com/office/drawing/2015/10/21/chartex" xmlns:cx3="http://schemas.microsoft.com/office/drawing/2016/5/9/chartex" xmlns:cx4="http://schemas.microsoft.com/office/drawing/2016/5/10/chartex" xmlns:cx5="http://schemas.microsoft.com/office/drawing/2016/5/11/chartex" xmlns:cx6="http://schemas.microsoft.com/office/drawing/2016/5/12/chartex" xmlns:cx7="http://schemas.microsoft.com/office/drawing/2016/5/13/chartex" xmlns:cx8="http://schemas.microsoft.com/office/drawing/2016/5/14/chartex" xmlns:mc="http://schemas.openxmlformats.org/markup-compatibility/2006" xmlns:aink="http://schemas.microsoft.com/office/drawing/2016/ink" xmlns:am3d="http://schemas.microsoft.com/office/drawing/2017/model3d" xmlns:o="urn:schemas-microsoft-com:office:office" xmlns:oel="http://schemas.microsoft.com/office/2019/extlst" xmlns:r="http://schemas.openxmlformats.org/officeDocument/2006/relationships" xmlns:m="http://schemas.openxmlformats.org/officeDocument/2006/math" xmlns:v="urn:schemas-microsoft-com:vml" xmlns:wp14="http://schemas.microsoft.com/office/word/2010/wordprocessingDrawing" xmlns:wp="http://schemas.openxmlformats.org/drawingml/2006/wordprocessingDrawing" xmlns:w10="urn:schemas-microsoft-com:office:word" xmlns:w="http://schemas.openxmlformats.org/wordprocessingml/2006/main" xmlns:w14="http://schemas.microsoft.com/office/word/2010/wordml" xmlns:w15="http://schemas.microsoft.com/office/word/2012/wordml" xmlns:w16cex="http://schemas.microsoft.com/office/word/2018/wordml/cex" xmlns:w16cid="http://schemas.microsoft.com/office/word/2016/wordml/cid" xmlns:w16="http://schemas.microsoft.com/office/word/2018/wordml" xmlns:w16sdtdh="http://schemas.microsoft.com/office/word/2020/wordml/sdtdatahash" xmlns:w16se="http://schemas.microsoft.com/office/word/2015/wordml/symex" xmlns:wpg="http://schemas.microsoft.com/office/word/2010/wordprocessingGroup" xmlns:wpi="http://schemas.microsoft.com/office/word/2010/wordprocessingInk" xmlns:wne="http://schemas.microsoft.com/office/word/2006/wordml" xmlns:wps="http://schemas.microsoft.com/office/word/2010/wordprocessingShape" mc:Ignorable="w14 w15 w16se w16cid w16 w16cex w16sdtdh wp14">
+<w:numbering xmlns:wpc="http://schemas.microsoft.com/office/word/2010/wordprocessingCanvas" xmlns:cx="http://schemas.microsoft.com/office/drawing/2014/chartex" xmlns:cx1="http://schemas.microsoft.com/office/drawing/2015/9/8/chartex" xmlns:cx2="http://schemas.microsoft.com/office/drawing/2015/10/21/chartex" xmlns:cx3="http://schemas.microsoft.com/office/drawing/2016/5/9/chartex" xmlns:cx4="http://schemas.microsoft.com/office/drawing/2016/5/10/chartex" xmlns:cx5="http://schemas.microsoft.com/office/drawing/2016/5/11/chartex" xmlns:cx6="http://schemas.microsoft.com/office/drawing/2016/5/12/chartex" xmlns:cx7="http://schemas.microsoft.com/office/drawing/2016/5/13/chartex" xmlns:cx8="http://schemas.microsoft.com/office/drawing/2016/5/14/chartex" xmlns:mc="http://schemas.openxmlformats.org/markup-compatibility/2006" xmlns:aink="http://schemas.microsoft.com/office/drawing/2016/ink" xmlns:am3d="http://schemas.microsoft.com/office/drawing/2017/model3d" xmlns:o="urn:schemas-microsoft-com:office:office" xmlns:oel="http://schemas.microsoft.com/office/2019/extlst" xmlns:r="http://schemas.openxmlformats.org/officeDocument/2006/relationships" xmlns:m="http://schemas.openxmlformats.org/officeDocument/2006/math" xmlns:v="urn:schemas-microsoft-com:vml" xmlns:wp14="http://schemas.microsoft.com/office/word/2010/wordprocessingDrawing" xmlns:wp="http://schemas.openxmlformats.org/drawingml/2006/wordprocessingDrawing" xmlns:w10="urn:schemas-microsoft-com:office:word" xmlns:w="http://schemas.openxmlformats.org/wordprocessingml/2006/main" xmlns:w14="http://schemas.microsoft.com/office/word/2010/wordml" xmlns:w15="http://schemas.microsoft.com/office/word/2012/wordml" xmlns:w16cex="http://schemas.microsoft.com/office/word/2018/wordml/cex" xmlns:w16cid="http://schemas.microsoft.com/office/word/2016/wordml/cid" xmlns:w16="http://schemas.microsoft.com/office/word/2018/wordml" xmlns:w16du="http://schemas.microsoft.com/office/word/2023/wordml/word16du" xmlns:w16sdtdh="http://schemas.microsoft.com/office/word/2020/wordml/sdtdatahash" xmlns:w16sdtfl="http://schemas.microsoft.com/office/word/2024/wordml/sdtformatlock" xmlns:w16se="http://schemas.microsoft.com/office/word/2015/wordml/symex" xmlns:wpg="http://schemas.microsoft.com/office/word/2010/wordprocessingGroup" xmlns:wpi="http://schemas.microsoft.com/office/word/2010/wordprocessingInk" xmlns:wne="http://schemas.microsoft.com/office/word/2006/wordml" xmlns:wps="http://schemas.microsoft.com/office/word/2010/wordprocessingShape" mc:Ignorable="w14 w15 w16se w16cid w16 w16cex w16sdtdh w16sdtfl w16du wp14">
   <w:abstractNum w:abstractNumId="0" w15:restartNumberingAfterBreak="0">
     <w:nsid w:val="46DE68DD"/>
     <w:multiLevelType w:val="hybridMultilevel"/>
@@ -659,7 +652,7 @@
 </file>
 
 <file path=word/styles.xml><?xml version="1.0" encoding="utf-8"?>
-<w:styles xmlns:mc="http://schemas.openxmlformats.org/markup-compatibility/2006" xmlns:r="http://schemas.openxmlformats.org/officeDocument/2006/relationships" xmlns:w="http://schemas.openxmlformats.org/wordprocessingml/2006/main" xmlns:w14="http://schemas.microsoft.com/office/word/2010/wordml" xmlns:w15="http://schemas.microsoft.com/office/word/2012/wordml" xmlns:w16cex="http://schemas.microsoft.com/office/word/2018/wordml/cex" xmlns:w16cid="http://schemas.microsoft.com/office/word/2016/wordml/cid" xmlns:w16="http://schemas.microsoft.com/office/word/2018/wordml" xmlns:w16sdtdh="http://schemas.microsoft.com/office/word/2020/wordml/sdtdatahash" xmlns:w16se="http://schemas.microsoft.com/office/word/2015/wordml/symex" mc:Ignorable="w14 w15 w16se w16cid w16 w16cex w16sdtdh">
+<w:styles xmlns:mc="http://schemas.openxmlformats.org/markup-compatibility/2006" xmlns:r="http://schemas.openxmlformats.org/officeDocument/2006/relationships" xmlns:w="http://schemas.openxmlformats.org/wordprocessingml/2006/main" xmlns:w14="http://schemas.microsoft.com/office/word/2010/wordml" xmlns:w15="http://schemas.microsoft.com/office/word/2012/wordml" xmlns:w16cex="http://schemas.microsoft.com/office/word/2018/wordml/cex" xmlns:w16cid="http://schemas.microsoft.com/office/word/2016/wordml/cid" xmlns:w16="http://schemas.microsoft.com/office/word/2018/wordml" xmlns:w16du="http://schemas.microsoft.com/office/word/2023/wordml/word16du" xmlns:w16sdtdh="http://schemas.microsoft.com/office/word/2020/wordml/sdtdatahash" xmlns:w16sdtfl="http://schemas.microsoft.com/office/word/2024/wordml/sdtformatlock" xmlns:w16se="http://schemas.microsoft.com/office/word/2015/wordml/symex" mc:Ignorable="w14 w15 w16se w16cid w16 w16cex w16sdtdh w16sdtfl w16du">
   <w:docDefaults>
     <w:rPrDefault>
       <w:rPr>

</xml_diff>